<commit_message>
U2 Part 1: move CUERDA before MAPACHE, matching 02.1
Jorge reordered the CUERDA block (caption + both tables) ahead of the
MAPACHE exercise in 02.1 Exercises FS.docx; LINUX stays last. Verified with
a body-order dump (paragraphs and tables interleaved) and a table-by-table
diff that the reorder was the only change - every paragraph and table cell
is otherwise byte-identical.

Reordered materials.json unit2.exercises.sets[0].items to CUERDA, MAPACHE,
LINUX and refreshed materials/unit2-financial-statements.docx from the same
source file.

Co-Authored-By: Claude Sonnet 5 <noreply@anthropic.com>
</commit_message>
<xml_diff>
--- a/materials/unit2-financial-statements.docx
+++ b/materials/unit2-financial-statements.docx
@@ -2,258 +2,6 @@
 <file path=word/document.xml><?xml version="1.0" encoding="utf-8"?>
 <w:document xmlns:wpc="http://schemas.microsoft.com/office/word/2010/wordprocessingCanvas" xmlns:cx="http://schemas.microsoft.com/office/drawing/2014/chartex" xmlns:cx1="http://schemas.microsoft.com/office/drawing/2015/9/8/chartex" xmlns:cx2="http://schemas.microsoft.com/office/drawing/2015/10/21/chartex" xmlns:cx3="http://schemas.microsoft.com/office/drawing/2016/5/9/chartex" xmlns:cx4="http://schemas.microsoft.com/office/drawing/2016/5/10/chartex" xmlns:cx5="http://schemas.microsoft.com/office/drawing/2016/5/11/chartex" xmlns:cx6="http://schemas.microsoft.com/office/drawing/2016/5/12/chartex" xmlns:cx7="http://schemas.microsoft.com/office/drawing/2016/5/13/chartex" xmlns:cx8="http://schemas.microsoft.com/office/drawing/2016/5/14/chartex" xmlns:mc="http://schemas.openxmlformats.org/markup-compatibility/2006" xmlns:aink="http://schemas.microsoft.com/office/drawing/2016/ink" xmlns:am3d="http://schemas.microsoft.com/office/drawing/2017/model3d" xmlns:o="urn:schemas-microsoft-com:office:office" xmlns:oel="http://schemas.microsoft.com/office/2019/extlst" xmlns:r="http://schemas.openxmlformats.org/officeDocument/2006/relationships" xmlns:m="http://schemas.openxmlformats.org/officeDocument/2006/math" xmlns:v="urn:schemas-microsoft-com:vml" xmlns:wp14="http://schemas.microsoft.com/office/word/2010/wordprocessingDrawing" xmlns:wp="http://schemas.openxmlformats.org/drawingml/2006/wordprocessingDrawing" xmlns:w10="urn:schemas-microsoft-com:office:word" xmlns:w="http://schemas.openxmlformats.org/wordprocessingml/2006/main" xmlns:w14="http://schemas.microsoft.com/office/word/2010/wordml" xmlns:w15="http://schemas.microsoft.com/office/word/2012/wordml" xmlns:w16cex="http://schemas.microsoft.com/office/word/2018/wordml/cex" xmlns:w16cid="http://schemas.microsoft.com/office/word/2016/wordml/cid" xmlns:w16="http://schemas.microsoft.com/office/word/2018/wordml" xmlns:w16du="http://schemas.microsoft.com/office/word/2023/wordml/word16du" xmlns:w16sdtdh="http://schemas.microsoft.com/office/word/2020/wordml/sdtdatahash" xmlns:w16sdtfl="http://schemas.microsoft.com/office/word/2024/wordml/sdtformatlock" xmlns:w16se="http://schemas.microsoft.com/office/word/2015/wordml/symex" xmlns:wpg="http://schemas.microsoft.com/office/word/2010/wordprocessingGroup" xmlns:wpi="http://schemas.microsoft.com/office/word/2010/wordprocessingInk" xmlns:wne="http://schemas.microsoft.com/office/word/2006/wordml" xmlns:wps="http://schemas.microsoft.com/office/word/2010/wordprocessingShape" mc:Ignorable="w14 w15 w16se w16cid w16 w16cex w16sdtdh w16sdtfl w16du wp14">
   <w:body>
-    <w:p>
-      <w:pPr>
-        <w:tabs>
-          <w:tab w:val="right" w:pos="9328"/>
-        </w:tabs>
-        <w:rPr>
-          <w:i/>
-          <w:iCs/>
-          <w:sz w:val="24"/>
-          <w:szCs w:val="24"/>
-        </w:rPr>
-      </w:pPr>
-      <w:r>
-        <w:rPr>
-          <w:sz w:val="24"/>
-          <w:szCs w:val="24"/>
-        </w:rPr>
-        <w:t xml:space="preserve">Knowing the balances of the </w:t>
-      </w:r>
-      <w:r>
-        <w:rPr>
-          <w:i/>
-          <w:iCs/>
-          <w:sz w:val="24"/>
-          <w:szCs w:val="24"/>
-        </w:rPr>
-        <w:t xml:space="preserve">Other Operating Income </w:t>
-      </w:r>
-      <w:r>
-        <w:rPr>
-          <w:sz w:val="24"/>
-          <w:szCs w:val="24"/>
-        </w:rPr>
-        <w:t xml:space="preserve">(€231,400) and </w:t>
-      </w:r>
-      <w:r>
-        <w:rPr>
-          <w:i/>
-          <w:iCs/>
-          <w:sz w:val="24"/>
-          <w:szCs w:val="24"/>
-        </w:rPr>
-        <w:t xml:space="preserve">Share Capital </w:t>
-      </w:r>
-      <w:r>
-        <w:rPr>
-          <w:sz w:val="24"/>
-          <w:szCs w:val="24"/>
-        </w:rPr>
-        <w:t xml:space="preserve">(€170,440) accounts, complete the Profit and Loss Account and Balance Sheet of </w:t>
-      </w:r>
-      <w:r>
-        <w:rPr>
-          <w:b/>
-          <w:bCs/>
-          <w:sz w:val="24"/>
-          <w:szCs w:val="24"/>
-        </w:rPr>
-        <w:t>MAPACHE</w:t>
-      </w:r>
-      <w:r>
-        <w:rPr>
-          <w:sz w:val="24"/>
-          <w:szCs w:val="24"/>
-        </w:rPr>
-        <w:t xml:space="preserve"> S.A. as at 31/12/2023. </w:t>
-      </w:r>
-      <w:r>
-        <w:rPr>
-          <w:sz w:val="24"/>
-          <w:szCs w:val="24"/>
-        </w:rPr>
-        <w:t xml:space="preserve">Obtain </w:t>
-      </w:r>
-      <w:r>
-        <w:rPr>
-          <w:sz w:val="24"/>
-          <w:szCs w:val="24"/>
-        </w:rPr>
-        <w:t>the cash balance by difference</w:t>
-      </w:r>
-      <w:r>
-        <w:rPr>
-          <w:sz w:val="24"/>
-          <w:szCs w:val="24"/>
-        </w:rPr>
-        <w:t>.</w:t>
-      </w:r>
-    </w:p>
-    <w:p>
-      <w:pPr>
-        <w:rPr>
-          <w:sz w:val="24"/>
-          <w:szCs w:val="24"/>
-        </w:rPr>
-      </w:pPr>
-      <w:r>
-        <w:rPr>
-          <w:sz w:val="24"/>
-          <w:szCs w:val="24"/>
-        </w:rPr>
-        <w:t xml:space="preserve">Volume discounts granted by suppliers are 5% of purchases and amount to €10,000. They will be applied to orders in the next financial year. They </w:t>
-      </w:r>
-      <w:r>
-        <w:rPr>
-          <w:sz w:val="24"/>
-          <w:szCs w:val="24"/>
-        </w:rPr>
-        <w:t>were</w:t>
-      </w:r>
-      <w:r>
-        <w:rPr>
-          <w:sz w:val="24"/>
-          <w:szCs w:val="24"/>
-        </w:rPr>
-        <w:t xml:space="preserve"> paid in cash.</w:t>
-      </w:r>
-      <w:r>
-        <w:rPr>
-          <w:sz w:val="24"/>
-          <w:szCs w:val="24"/>
-        </w:rPr>
-        <w:t xml:space="preserve"> </w:t>
-      </w:r>
-      <w:r>
-        <w:rPr>
-          <w:sz w:val="24"/>
-          <w:szCs w:val="24"/>
-        </w:rPr>
-        <w:t>Sales occur on a regular basis. The amount shown in the profit and loss account is €600,000. As of 31/12/2023, sales from the last two months are still outstanding.</w:t>
-      </w:r>
-    </w:p>
-    <w:p>
-      <w:pPr>
-        <w:rPr>
-          <w:sz w:val="24"/>
-          <w:szCs w:val="24"/>
-        </w:rPr>
-      </w:pPr>
-      <w:r>
-        <w:rPr>
-          <w:sz w:val="24"/>
-          <w:szCs w:val="24"/>
-        </w:rPr>
-        <w:t>From the trial balance as at 30/09/2023, the following balances are available: Inventories €35,000; Impairment of Inventories €2,000. At year-end, inventories have a cost of €50,000 and a net realisable value of €46,000.</w:t>
-      </w:r>
-    </w:p>
-    <w:p>
-      <w:pPr>
-        <w:rPr>
-          <w:sz w:val="24"/>
-          <w:szCs w:val="24"/>
-        </w:rPr>
-      </w:pPr>
-      <w:r>
-        <w:rPr>
-          <w:sz w:val="24"/>
-          <w:szCs w:val="24"/>
-        </w:rPr>
-        <w:t>On 31/08/2023, MAPACHE contracted consultancy services for €100 per month, payable every six months at the end of the period.</w:t>
-      </w:r>
-    </w:p>
-    <w:p>
-      <w:pPr>
-        <w:rPr>
-          <w:sz w:val="24"/>
-          <w:szCs w:val="24"/>
-        </w:rPr>
-      </w:pPr>
-      <w:r>
-        <w:rPr>
-          <w:rFonts w:eastAsia="EB Garamond" w:cs="EB Garamond"/>
-          <w:sz w:val="24"/>
-          <w:szCs w:val="24"/>
-        </w:rPr>
-        <w:t>On 30/09/2020, MAPACHE purchased a machine for €90,000. Installation costs amounted to €10,000, and the machine became operational on 01/01/2021. By the end of 2023, its amortisation expense is €30,000, and the accumulated amortisation amounts to €60,000.</w:t>
-      </w:r>
-    </w:p>
-    <w:p>
-      <w:pPr>
-        <w:rPr>
-          <w:sz w:val="24"/>
-          <w:szCs w:val="24"/>
-        </w:rPr>
-      </w:pPr>
-      <w:r>
-        <w:rPr>
-          <w:sz w:val="24"/>
-          <w:szCs w:val="24"/>
-        </w:rPr>
-        <w:t>At the beginning of the year, MAPACHE had two vehicles: a van and a motorbike, purchased for €25,000 and €6,000, respectively. Both vehicles have a residual value of €1,000. The motorbike was fully amortised in 2022 and was sold in May this year for €500, which was collected at the time of sale. For the van, the annual amortisation expense is €2,400, and the accumulated amortisation amounts to €14,400.</w:t>
-      </w:r>
-    </w:p>
-    <w:p>
-      <w:pPr>
-        <w:rPr>
-          <w:sz w:val="24"/>
-          <w:szCs w:val="24"/>
-        </w:rPr>
-      </w:pPr>
-      <w:r>
-        <w:rPr>
-          <w:sz w:val="24"/>
-          <w:szCs w:val="24"/>
-        </w:rPr>
-        <w:t xml:space="preserve">The balance sheet as at 31/12/2023 shows a liability to the tax authorities of €8,640. Employees receive 14 monthly payments, with the extra payments made in June and December. The employer’s social security contribution is 20%, the employee’s contribution is 3%, and income tax withholding is 6%. Payments to Social Security are made monthly, and payments to the tax authorities are made quarterly. </w:t>
-      </w:r>
-    </w:p>
-    <w:p>
-      <w:pPr>
-        <w:rPr>
-          <w:sz w:val="24"/>
-          <w:szCs w:val="24"/>
-        </w:rPr>
-      </w:pPr>
-      <w:r>
-        <w:rPr>
-          <w:sz w:val="24"/>
-          <w:szCs w:val="24"/>
-        </w:rPr>
-        <w:t>MAPACHE has granted its employees a loan of €33,840, which will be deducted from the 2024 payroll.</w:t>
-      </w:r>
-    </w:p>
-    <w:p>
-      <w:pPr>
-        <w:rPr>
-          <w:b/>
-          <w:bCs/>
-        </w:rPr>
-      </w:pPr>
-      <w:r>
-        <w:rPr>
-          <w:sz w:val="24"/>
-          <w:szCs w:val="24"/>
-        </w:rPr>
-        <w:t>On 01/01/2023, MAPACHE obtained a loan of €90,000, agreeing with the financial institution to repay it in two instalments: €50,000 on 31/12/2023 and €49,541 on 31/12/2024. The effective interest rate is 7%.</w:t>
-      </w:r>
-      <w:r>
-        <w:rPr>
-          <w:sz w:val="24"/>
-          <w:szCs w:val="24"/>
-        </w:rPr>
-        <w:t xml:space="preserve"> </w:t>
-      </w:r>
-      <w:r>
-        <w:rPr>
-          <w:b/>
-          <w:bCs/>
-        </w:rPr>
-        <w:br w:type="page"/>
-      </w:r>
-    </w:p>
     <w:p>
       <w:pPr>
         <w:tabs>
@@ -276,7 +24,6 @@
           <w:sz w:val="24"/>
           <w:szCs w:val="24"/>
         </w:rPr>
-        <w:lastRenderedPageBreak/>
         <w:t xml:space="preserve">Balance sheet of CUERDA, S.A. </w:t>
       </w:r>
       <w:r>
@@ -554,30 +301,14 @@
                 <w:sz w:val="24"/>
                 <w:szCs w:val="24"/>
               </w:rPr>
-              <w:t xml:space="preserve">(281) </w:t>
-            </w:r>
-            <w:proofErr w:type="gramStart"/>
-            <w:r>
-              <w:rPr>
-                <w:sz w:val="24"/>
-                <w:szCs w:val="24"/>
-              </w:rPr>
-              <w:t xml:space="preserve">Accumulated </w:t>
-            </w:r>
-            <w:r>
-              <w:rPr>
-                <w:sz w:val="24"/>
-                <w:szCs w:val="24"/>
-              </w:rPr>
-              <w:t xml:space="preserve"> amortisation</w:t>
-            </w:r>
-            <w:proofErr w:type="gramEnd"/>
-            <w:r>
-              <w:rPr>
-                <w:sz w:val="24"/>
-                <w:szCs w:val="24"/>
-              </w:rPr>
-              <w:t xml:space="preserve"> </w:t>
+              <w:t xml:space="preserve">(281) Accumulated </w:t>
+            </w:r>
+            <w:r>
+              <w:rPr>
+                <w:sz w:val="24"/>
+                <w:szCs w:val="24"/>
+              </w:rPr>
+              <w:t xml:space="preserve"> amortisation </w:t>
             </w:r>
             <w:r>
               <w:rPr>
@@ -626,30 +357,14 @@
                 <w:sz w:val="24"/>
                 <w:szCs w:val="24"/>
               </w:rPr>
-              <w:t xml:space="preserve">(281) </w:t>
-            </w:r>
-            <w:proofErr w:type="gramStart"/>
-            <w:r>
-              <w:rPr>
-                <w:sz w:val="24"/>
-                <w:szCs w:val="24"/>
-              </w:rPr>
-              <w:t xml:space="preserve">Accumulated </w:t>
-            </w:r>
-            <w:r>
-              <w:rPr>
-                <w:sz w:val="24"/>
-                <w:szCs w:val="24"/>
-              </w:rPr>
-              <w:t xml:space="preserve"> amortisation</w:t>
-            </w:r>
-            <w:proofErr w:type="gramEnd"/>
-            <w:r>
-              <w:rPr>
-                <w:sz w:val="24"/>
-                <w:szCs w:val="24"/>
-              </w:rPr>
-              <w:t xml:space="preserve"> </w:t>
+              <w:t xml:space="preserve">(281) Accumulated </w:t>
+            </w:r>
+            <w:r>
+              <w:rPr>
+                <w:sz w:val="24"/>
+                <w:szCs w:val="24"/>
+              </w:rPr>
+              <w:t xml:space="preserve"> amortisation </w:t>
             </w:r>
             <w:r>
               <w:rPr>
@@ -3554,6 +3269,203 @@
     </w:p>
     <w:p>
       <w:pPr>
+        <w:tabs>
+          <w:tab w:val="right" w:pos="9328"/>
+        </w:tabs>
+        <w:rPr>
+          <w:i/>
+          <w:iCs/>
+          <w:sz w:val="24"/>
+          <w:szCs w:val="24"/>
+        </w:rPr>
+      </w:pPr>
+      <w:r>
+        <w:rPr>
+          <w:sz w:val="24"/>
+          <w:szCs w:val="24"/>
+        </w:rPr>
+        <w:lastRenderedPageBreak/>
+        <w:t xml:space="preserve">Knowing the balances of the </w:t>
+      </w:r>
+      <w:r>
+        <w:rPr>
+          <w:i/>
+          <w:iCs/>
+          <w:sz w:val="24"/>
+          <w:szCs w:val="24"/>
+        </w:rPr>
+        <w:t xml:space="preserve">Other Operating Income </w:t>
+      </w:r>
+      <w:r>
+        <w:rPr>
+          <w:sz w:val="24"/>
+          <w:szCs w:val="24"/>
+        </w:rPr>
+        <w:t xml:space="preserve">(€231,400) and </w:t>
+      </w:r>
+      <w:r>
+        <w:rPr>
+          <w:i/>
+          <w:iCs/>
+          <w:sz w:val="24"/>
+          <w:szCs w:val="24"/>
+        </w:rPr>
+        <w:t xml:space="preserve">Share Capital </w:t>
+      </w:r>
+      <w:r>
+        <w:rPr>
+          <w:sz w:val="24"/>
+          <w:szCs w:val="24"/>
+        </w:rPr>
+        <w:t xml:space="preserve">(€170,440) accounts, complete the Profit and Loss Account and Balance Sheet of </w:t>
+      </w:r>
+      <w:r>
+        <w:rPr>
+          <w:b/>
+          <w:bCs/>
+          <w:sz w:val="24"/>
+          <w:szCs w:val="24"/>
+        </w:rPr>
+        <w:t>MAPACHE</w:t>
+      </w:r>
+      <w:r>
+        <w:rPr>
+          <w:sz w:val="24"/>
+          <w:szCs w:val="24"/>
+        </w:rPr>
+        <w:t xml:space="preserve"> S.A. as at 31/12/2023. Obtain the cash balance by difference.</w:t>
+      </w:r>
+    </w:p>
+    <w:p>
+      <w:pPr>
+        <w:rPr>
+          <w:sz w:val="24"/>
+          <w:szCs w:val="24"/>
+        </w:rPr>
+      </w:pPr>
+      <w:r>
+        <w:rPr>
+          <w:sz w:val="24"/>
+          <w:szCs w:val="24"/>
+        </w:rPr>
+        <w:t>Volume discounts granted by suppliers are 5% of purchases and amount to €10,000. They will be applied to orders in the next financial year. They were paid in cash. Sales occur on a regular basis. The amount shown in the profit and loss account is €600,000. As of 31/12/2023, sales from the last two months are still outstanding.</w:t>
+      </w:r>
+    </w:p>
+    <w:p>
+      <w:pPr>
+        <w:rPr>
+          <w:sz w:val="24"/>
+          <w:szCs w:val="24"/>
+        </w:rPr>
+      </w:pPr>
+      <w:r>
+        <w:rPr>
+          <w:sz w:val="24"/>
+          <w:szCs w:val="24"/>
+        </w:rPr>
+        <w:t>From the trial balance as at 30/09/2023, the following balances are available: Inventories €35,000; Impairment of Inventories €2,000. At year-end, inventories have a cost of €50,000 and a net realisable value of €46,000.</w:t>
+      </w:r>
+    </w:p>
+    <w:p>
+      <w:pPr>
+        <w:rPr>
+          <w:sz w:val="24"/>
+          <w:szCs w:val="24"/>
+        </w:rPr>
+      </w:pPr>
+      <w:r>
+        <w:rPr>
+          <w:sz w:val="24"/>
+          <w:szCs w:val="24"/>
+        </w:rPr>
+        <w:t>On 31/08/2023, MAPACHE contracted consultancy services for €100 per month, payable every six months at the end of the period.</w:t>
+      </w:r>
+    </w:p>
+    <w:p>
+      <w:pPr>
+        <w:rPr>
+          <w:sz w:val="24"/>
+          <w:szCs w:val="24"/>
+        </w:rPr>
+      </w:pPr>
+      <w:r>
+        <w:rPr>
+          <w:rFonts w:eastAsia="EB Garamond" w:cs="EB Garamond"/>
+          <w:sz w:val="24"/>
+          <w:szCs w:val="24"/>
+        </w:rPr>
+        <w:t>On 30/09/2020, MAPACHE purchased a machine for €90,000. Installation costs amounted to €10,000, and the machine became operational on 01/01/2021. By the end of 2023, its amortisation expense is €30,000, and the accumulated amortisation amounts to €60,000.</w:t>
+      </w:r>
+    </w:p>
+    <w:p>
+      <w:pPr>
+        <w:rPr>
+          <w:sz w:val="24"/>
+          <w:szCs w:val="24"/>
+        </w:rPr>
+      </w:pPr>
+      <w:r>
+        <w:rPr>
+          <w:sz w:val="24"/>
+          <w:szCs w:val="24"/>
+        </w:rPr>
+        <w:t>At the beginning of the year, MAPACHE had two vehicles: a van and a motorbike, purchased for €25,000 and €6,000, respectively. Both vehicles have a residual value of €1,000. The motorbike was fully amortised in 2022 and was sold in May this year for €500, which was collected at the time of sale. For the van, the annual amortisation expense is €2,400, and the accumulated amortisation amounts to €14,400.</w:t>
+      </w:r>
+    </w:p>
+    <w:p>
+      <w:pPr>
+        <w:rPr>
+          <w:sz w:val="24"/>
+          <w:szCs w:val="24"/>
+        </w:rPr>
+      </w:pPr>
+      <w:r>
+        <w:rPr>
+          <w:sz w:val="24"/>
+          <w:szCs w:val="24"/>
+        </w:rPr>
+        <w:t xml:space="preserve">The balance sheet as at 31/12/2023 shows a liability to the tax authorities of €8,640. Employees receive 14 monthly payments, with the extra payments made in June and December. The employer’s social security contribution is 20%, the employee’s contribution is 3%, and income tax withholding is 6%. Payments to Social Security are made monthly, and payments to the tax authorities are made quarterly. </w:t>
+      </w:r>
+    </w:p>
+    <w:p>
+      <w:pPr>
+        <w:rPr>
+          <w:sz w:val="24"/>
+          <w:szCs w:val="24"/>
+        </w:rPr>
+      </w:pPr>
+      <w:r>
+        <w:rPr>
+          <w:sz w:val="24"/>
+          <w:szCs w:val="24"/>
+        </w:rPr>
+        <w:t>MAPACHE has granted its employees a loan of €33,840, which will be deducted from the 2024 payroll.</w:t>
+      </w:r>
+    </w:p>
+    <w:p>
+      <w:pPr>
+        <w:rPr>
+          <w:b/>
+          <w:bCs/>
+        </w:rPr>
+      </w:pPr>
+      <w:r>
+        <w:rPr>
+          <w:sz w:val="24"/>
+          <w:szCs w:val="24"/>
+        </w:rPr>
+        <w:t xml:space="preserve">On 01/01/2023, MAPACHE obtained a loan of €90,000, agreeing with the financial institution to repay it in two instalments: €50,000 on 31/12/2023 and €49,541 on 31/12/2024. The effective interest rate is 7%. </w:t>
+      </w:r>
+      <w:r>
+        <w:rPr>
+          <w:b/>
+          <w:bCs/>
+        </w:rPr>
+        <w:br w:type="page"/>
+      </w:r>
+    </w:p>
+    <w:p>
+      <w:pPr>
         <w:widowControl/>
         <w:tabs>
           <w:tab w:val="clear" w:pos="833"/>
@@ -3604,15 +3516,7 @@
         <w:ind w:right="0"/>
       </w:pPr>
       <w:r>
-        <w:t xml:space="preserve">Other information to be </w:t>
-      </w:r>
-      <w:proofErr w:type="gramStart"/>
-      <w:r>
-        <w:t>taken into account</w:t>
-      </w:r>
-      <w:proofErr w:type="gramEnd"/>
-      <w:r>
-        <w:t xml:space="preserve"> when preparing the required financial statements is given in the following points:</w:t>
+        <w:t>Other information to be taken into account when preparing the required financial statements is given in the following points:</w:t>
       </w:r>
     </w:p>
     <w:p>
@@ -3670,13 +3574,8 @@
       <w:r>
         <w:t xml:space="preserve">4.- </w:t>
       </w:r>
-      <w:proofErr w:type="gramStart"/>
       <w:r>
-        <w:t>With regard to</w:t>
-      </w:r>
-      <w:proofErr w:type="gramEnd"/>
-      <w:r>
-        <w:t xml:space="preserve"> the company’s amortisation policy:</w:t>
+        <w:t>With regard to the company’s amortisation policy:</w:t>
       </w:r>
     </w:p>
     <w:p>

</xml_diff>